<commit_message>
:books: Atualizando documentação task 150
</commit_message>
<xml_diff>
--- a/Documents/Documents/Sprint11_Task150_Implementacao_de_validacoes_e_padronizacoes_na_classe_manufacturer.docx
+++ b/Documents/Documents/Sprint11_Task150_Implementacao_de_validacoes_e_padronizacoes_na_classe_manufacturer.docx
@@ -865,7 +865,7 @@
           <w:p>
             <w:r>
               <w:rPr/>
-              <w:t>15</w:t>
+              <w:t>20</w:t>
             </w:r>
             <w:r>
               <w:rPr/>
@@ -881,7 +881,7 @@
           <w:p>
             <w:r>
               <w:rPr/>
-              <w:t>15</w:t>
+              <w:t>20</w:t>
             </w:r>
             <w:r>
               <w:rPr/>

</xml_diff>